<commit_message>
Triangle alert design change. Remove ticker and include group get tickers
</commit_message>
<xml_diff>
--- a/Documents/API Documents/2. Ascending  Descending Triangle Breakout Alert.docx
+++ b/Documents/API Documents/2. Ascending  Descending Triangle Breakout Alert.docx
@@ -606,7 +606,26 @@
                 <w:sz w:val="18"/>
                 <w:szCs w:val="18"/>
               </w:rPr>
-              <w:t>/api/eodanalytics/MarketAlert/TriangleBreakout/{exchange}/{ticker?}</w:t>
+              <w:t>/api/eodanalytics/MarketAlert/</w:t>
+            </w:r>
+            <w:r>
+              <w:rPr>
+                <w:rFonts w:hint="default" w:eastAsia="Consolas" w:cs="Cambria" w:asciiTheme="minorAscii" w:hAnsiTheme="minorAscii"/>
+                <w:sz w:val="18"/>
+                <w:szCs w:val="18"/>
+                <w:lang w:val="en-US"/>
+              </w:rPr>
+              <w:t>Triangle</w:t>
+            </w:r>
+            <w:bookmarkStart w:id="0" w:name="_GoBack"/>
+            <w:bookmarkEnd w:id="0"/>
+            <w:r>
+              <w:rPr>
+                <w:rFonts w:hint="default" w:eastAsia="Consolas" w:cs="Cambria" w:asciiTheme="minorAscii" w:hAnsiTheme="minorAscii"/>
+                <w:sz w:val="18"/>
+                <w:szCs w:val="18"/>
+              </w:rPr>
+              <w:t>/{exchange}/{ticker?}</w:t>
             </w:r>
           </w:p>
         </w:tc>
@@ -11670,8 +11689,6 @@
         </w:rPr>
         <w:t>Triangle:</w:t>
       </w:r>
-      <w:bookmarkStart w:id="0" w:name="_GoBack"/>
-      <w:bookmarkEnd w:id="0"/>
     </w:p>
     <w:p>
       <w:pPr>

</xml_diff>

<commit_message>
Move TriangleAlert.json to MarketAlert project and Fix LogTrace
</commit_message>
<xml_diff>
--- a/Documents/API Documents/2. Ascending  Descending Triangle Breakout Alert.docx
+++ b/Documents/API Documents/2. Ascending  Descending Triangle Breakout Alert.docx
@@ -617,15 +617,30 @@
               </w:rPr>
               <w:t>Triangle</w:t>
             </w:r>
-            <w:bookmarkStart w:id="0" w:name="_GoBack"/>
-            <w:bookmarkEnd w:id="0"/>
             <w:r>
               <w:rPr>
                 <w:rFonts w:hint="default" w:eastAsia="Consolas" w:cs="Cambria" w:asciiTheme="minorAscii" w:hAnsiTheme="minorAscii"/>
                 <w:sz w:val="18"/>
                 <w:szCs w:val="18"/>
               </w:rPr>
-              <w:t>/{exchange}/{ticker?}</w:t>
+              <w:t>/{exchange}/{</w:t>
+            </w:r>
+            <w:r>
+              <w:rPr>
+                <w:rFonts w:hint="default" w:eastAsia="Consolas" w:cs="Cambria" w:asciiTheme="minorAscii" w:hAnsiTheme="minorAscii"/>
+                <w:sz w:val="18"/>
+                <w:szCs w:val="18"/>
+                <w:lang w:val="en-US"/>
+              </w:rPr>
+              <w:t>index/sector</w:t>
+            </w:r>
+            <w:r>
+              <w:rPr>
+                <w:rFonts w:hint="default" w:eastAsia="Consolas" w:cs="Cambria" w:asciiTheme="minorAscii" w:hAnsiTheme="minorAscii"/>
+                <w:sz w:val="18"/>
+                <w:szCs w:val="18"/>
+              </w:rPr>
+              <w:t>?}</w:t>
             </w:r>
           </w:p>
         </w:tc>
@@ -2509,248 +2524,6 @@
           </w:p>
         </w:tc>
       </w:tr>
-      <w:tr>
-        <w:tblPrEx>
-          <w:tblBorders>
-            <w:top w:val="single" w:color="auto" w:sz="4" w:space="0"/>
-            <w:left w:val="single" w:color="auto" w:sz="4" w:space="0"/>
-            <w:bottom w:val="single" w:color="auto" w:sz="4" w:space="0"/>
-            <w:right w:val="single" w:color="auto" w:sz="4" w:space="0"/>
-            <w:insideH w:val="single" w:color="auto" w:sz="4" w:space="0"/>
-            <w:insideV w:val="single" w:color="auto" w:sz="4" w:space="0"/>
-          </w:tblBorders>
-          <w:tblCellMar>
-            <w:top w:w="0" w:type="dxa"/>
-            <w:left w:w="10" w:type="dxa"/>
-            <w:bottom w:w="0" w:type="dxa"/>
-            <w:right w:w="10" w:type="dxa"/>
-          </w:tblCellMar>
-        </w:tblPrEx>
-        <w:tc>
-          <w:tcPr>
-            <w:tcW w:w="1883" w:type="dxa"/>
-            <w:tcBorders>
-              <w:top w:val="single" w:color="BFC5CD" w:sz="4" w:space="0"/>
-              <w:left w:val="single" w:color="BFC5CD" w:sz="4" w:space="0"/>
-              <w:bottom w:val="single" w:color="BFC5CD" w:sz="4" w:space="0"/>
-              <w:right w:val="single" w:color="BFC5CD" w:sz="4" w:space="0"/>
-            </w:tcBorders>
-            <w:tcMar>
-              <w:top w:w="60" w:type="dxa"/>
-              <w:left w:w="100" w:type="dxa"/>
-              <w:bottom w:w="60" w:type="dxa"/>
-              <w:right w:w="100" w:type="dxa"/>
-            </w:tcMar>
-          </w:tcPr>
-          <w:p>
-            <w:pPr>
-              <w:rPr>
-                <w:rFonts w:hint="default" w:ascii="Calibri" w:hAnsi="Calibri" w:eastAsia="Consolas" w:cs="Calibri"/>
-                <w:sz w:val="20"/>
-                <w:szCs w:val="20"/>
-              </w:rPr>
-            </w:pPr>
-            <w:r>
-              <w:rPr>
-                <w:rFonts w:hint="default" w:ascii="Calibri" w:hAnsi="Calibri" w:eastAsia="Consolas" w:cs="Calibri"/>
-                <w:sz w:val="20"/>
-                <w:szCs w:val="20"/>
-              </w:rPr>
-              <w:t>breakout</w:t>
-            </w:r>
-          </w:p>
-        </w:tc>
-        <w:tc>
-          <w:tcPr>
-            <w:tcW w:w="1068" w:type="dxa"/>
-            <w:tcBorders>
-              <w:top w:val="single" w:color="BFC5CD" w:sz="4" w:space="0"/>
-              <w:left w:val="single" w:color="BFC5CD" w:sz="4" w:space="0"/>
-              <w:bottom w:val="single" w:color="BFC5CD" w:sz="4" w:space="0"/>
-              <w:right w:val="single" w:color="BFC5CD" w:sz="4" w:space="0"/>
-            </w:tcBorders>
-            <w:tcMar>
-              <w:top w:w="60" w:type="dxa"/>
-              <w:left w:w="100" w:type="dxa"/>
-              <w:bottom w:w="60" w:type="dxa"/>
-              <w:right w:w="100" w:type="dxa"/>
-            </w:tcMar>
-          </w:tcPr>
-          <w:p>
-            <w:pPr>
-              <w:rPr>
-                <w:rFonts w:hint="default" w:ascii="Calibri" w:hAnsi="Calibri" w:eastAsia="Consolas" w:cs="Calibri"/>
-                <w:sz w:val="20"/>
-                <w:szCs w:val="20"/>
-                <w:lang w:val="en-US"/>
-              </w:rPr>
-            </w:pPr>
-            <w:r>
-              <w:rPr>
-                <w:rFonts w:hint="default" w:ascii="Calibri" w:hAnsi="Calibri" w:eastAsia="Consolas" w:cs="Calibri"/>
-                <w:sz w:val="20"/>
-                <w:szCs w:val="20"/>
-                <w:lang w:val="en-US"/>
-              </w:rPr>
-              <w:t>bool</w:t>
-            </w:r>
-          </w:p>
-        </w:tc>
-        <w:tc>
-          <w:tcPr>
-            <w:tcW w:w="6075" w:type="dxa"/>
-            <w:tcBorders>
-              <w:top w:val="single" w:color="BFC5CD" w:sz="4" w:space="0"/>
-              <w:left w:val="single" w:color="BFC5CD" w:sz="4" w:space="0"/>
-              <w:bottom w:val="single" w:color="BFC5CD" w:sz="4" w:space="0"/>
-              <w:right w:val="single" w:color="BFC5CD" w:sz="4" w:space="0"/>
-            </w:tcBorders>
-            <w:tcMar>
-              <w:top w:w="60" w:type="dxa"/>
-              <w:left w:w="100" w:type="dxa"/>
-              <w:bottom w:w="60" w:type="dxa"/>
-              <w:right w:w="100" w:type="dxa"/>
-            </w:tcMar>
-          </w:tcPr>
-          <w:p>
-            <w:pPr>
-              <w:rPr>
-                <w:rFonts w:hint="default" w:ascii="Calibri" w:hAnsi="Calibri" w:eastAsia="Consolas" w:cs="Calibri"/>
-                <w:sz w:val="20"/>
-                <w:szCs w:val="20"/>
-              </w:rPr>
-            </w:pPr>
-            <w:r>
-              <w:rPr>
-                <w:rFonts w:hint="default" w:ascii="Calibri" w:hAnsi="Calibri" w:eastAsia="Consolas" w:cs="Calibri"/>
-                <w:sz w:val="20"/>
-                <w:szCs w:val="20"/>
-              </w:rPr>
-              <w:t>Whether breakout condition is satisfied</w:t>
-            </w:r>
-          </w:p>
-        </w:tc>
-      </w:tr>
-      <w:tr>
-        <w:tblPrEx>
-          <w:tblBorders>
-            <w:top w:val="single" w:color="auto" w:sz="4" w:space="0"/>
-            <w:left w:val="single" w:color="auto" w:sz="4" w:space="0"/>
-            <w:bottom w:val="single" w:color="auto" w:sz="4" w:space="0"/>
-            <w:right w:val="single" w:color="auto" w:sz="4" w:space="0"/>
-            <w:insideH w:val="single" w:color="auto" w:sz="4" w:space="0"/>
-            <w:insideV w:val="single" w:color="auto" w:sz="4" w:space="0"/>
-          </w:tblBorders>
-          <w:tblCellMar>
-            <w:top w:w="0" w:type="dxa"/>
-            <w:left w:w="10" w:type="dxa"/>
-            <w:bottom w:w="0" w:type="dxa"/>
-            <w:right w:w="10" w:type="dxa"/>
-          </w:tblCellMar>
-        </w:tblPrEx>
-        <w:tc>
-          <w:tcPr>
-            <w:tcW w:w="1883" w:type="dxa"/>
-            <w:tcBorders>
-              <w:top w:val="single" w:color="BFC5CD" w:sz="4" w:space="0"/>
-              <w:left w:val="single" w:color="BFC5CD" w:sz="4" w:space="0"/>
-              <w:bottom w:val="single" w:color="BFC5CD" w:sz="4" w:space="0"/>
-              <w:right w:val="single" w:color="BFC5CD" w:sz="4" w:space="0"/>
-            </w:tcBorders>
-            <w:tcMar>
-              <w:top w:w="60" w:type="dxa"/>
-              <w:left w:w="100" w:type="dxa"/>
-              <w:bottom w:w="60" w:type="dxa"/>
-              <w:right w:w="100" w:type="dxa"/>
-            </w:tcMar>
-          </w:tcPr>
-          <w:p>
-            <w:pPr>
-              <w:rPr>
-                <w:rFonts w:hint="default" w:ascii="Calibri" w:hAnsi="Calibri" w:eastAsia="Consolas" w:cs="Calibri"/>
-                <w:sz w:val="20"/>
-                <w:szCs w:val="20"/>
-              </w:rPr>
-            </w:pPr>
-            <w:r>
-              <w:rPr>
-                <w:rFonts w:hint="default" w:ascii="Calibri" w:hAnsi="Calibri" w:eastAsia="Consolas" w:cs="Calibri"/>
-                <w:sz w:val="20"/>
-                <w:szCs w:val="20"/>
-              </w:rPr>
-              <w:t>breakoutDirection</w:t>
-            </w:r>
-          </w:p>
-        </w:tc>
-        <w:tc>
-          <w:tcPr>
-            <w:tcW w:w="1068" w:type="dxa"/>
-            <w:tcBorders>
-              <w:top w:val="single" w:color="BFC5CD" w:sz="4" w:space="0"/>
-              <w:left w:val="single" w:color="BFC5CD" w:sz="4" w:space="0"/>
-              <w:bottom w:val="single" w:color="BFC5CD" w:sz="4" w:space="0"/>
-              <w:right w:val="single" w:color="BFC5CD" w:sz="4" w:space="0"/>
-            </w:tcBorders>
-            <w:tcMar>
-              <w:top w:w="60" w:type="dxa"/>
-              <w:left w:w="100" w:type="dxa"/>
-              <w:bottom w:w="60" w:type="dxa"/>
-              <w:right w:w="100" w:type="dxa"/>
-            </w:tcMar>
-          </w:tcPr>
-          <w:p>
-            <w:pPr>
-              <w:rPr>
-                <w:rFonts w:hint="default" w:ascii="Calibri" w:hAnsi="Calibri" w:eastAsia="Consolas" w:cs="Calibri"/>
-                <w:sz w:val="20"/>
-                <w:szCs w:val="20"/>
-              </w:rPr>
-            </w:pPr>
-            <w:r>
-              <w:rPr>
-                <w:rFonts w:hint="default" w:ascii="Calibri" w:hAnsi="Calibri" w:eastAsia="Consolas" w:cs="Calibri"/>
-                <w:sz w:val="20"/>
-                <w:szCs w:val="20"/>
-              </w:rPr>
-              <w:t>string</w:t>
-            </w:r>
-          </w:p>
-        </w:tc>
-        <w:tc>
-          <w:tcPr>
-            <w:tcW w:w="6075" w:type="dxa"/>
-            <w:tcBorders>
-              <w:top w:val="single" w:color="BFC5CD" w:sz="4" w:space="0"/>
-              <w:left w:val="single" w:color="BFC5CD" w:sz="4" w:space="0"/>
-              <w:bottom w:val="single" w:color="BFC5CD" w:sz="4" w:space="0"/>
-              <w:right w:val="single" w:color="BFC5CD" w:sz="4" w:space="0"/>
-            </w:tcBorders>
-            <w:tcMar>
-              <w:top w:w="60" w:type="dxa"/>
-              <w:left w:w="100" w:type="dxa"/>
-              <w:bottom w:w="60" w:type="dxa"/>
-              <w:right w:w="100" w:type="dxa"/>
-            </w:tcMar>
-          </w:tcPr>
-          <w:p>
-            <w:pPr>
-              <w:rPr>
-                <w:rFonts w:hint="default" w:ascii="Calibri" w:hAnsi="Calibri" w:eastAsia="Consolas" w:cs="Calibri"/>
-                <w:sz w:val="20"/>
-                <w:szCs w:val="20"/>
-              </w:rPr>
-            </w:pPr>
-            <w:r>
-              <w:rPr>
-                <w:rFonts w:hint="default" w:ascii="Calibri" w:hAnsi="Calibri" w:eastAsia="Consolas" w:cs="Calibri"/>
-                <w:sz w:val="20"/>
-                <w:szCs w:val="20"/>
-              </w:rPr>
-              <w:t>Bullish/ Bearish/None</w:t>
-            </w:r>
-          </w:p>
-        </w:tc>
-      </w:tr>
     </w:tbl>
     <w:p>
       <w:pPr>
@@ -3093,59 +2866,15 @@
           <w:szCs w:val="17"/>
         </w:rPr>
       </w:pPr>
+      <w:bookmarkStart w:id="0" w:name="_GoBack"/>
+      <w:bookmarkEnd w:id="0"/>
       <w:r>
         <w:rPr>
           <w:rFonts w:hint="default" w:ascii="Consolas" w:hAnsi="Consolas" w:eastAsia="Consolas" w:cs="Consolas"/>
           <w:sz w:val="17"/>
           <w:szCs w:val="17"/>
         </w:rPr>
-        <w:t xml:space="preserve">      "lastCandleDate": "2026-09-28",</w:t>
-      </w:r>
-    </w:p>
-    <w:p>
-      <w:pPr>
-        <w:pBdr>
-          <w:left w:val="single" w:color="9CA3AF" w:sz="12" w:space="6"/>
-        </w:pBdr>
-        <w:shd w:val="clear" w:color="auto" w:fill="F3F4F6"/>
-        <w:spacing w:after="160" w:line="260" w:lineRule="auto"/>
-        <w:ind w:left="120" w:right="120"/>
-        <w:rPr>
-          <w:rFonts w:hint="default" w:ascii="Consolas" w:hAnsi="Consolas" w:eastAsia="Consolas" w:cs="Consolas"/>
-          <w:sz w:val="17"/>
-          <w:szCs w:val="17"/>
-        </w:rPr>
-      </w:pPr>
-      <w:r>
-        <w:rPr>
-          <w:rFonts w:hint="default" w:ascii="Consolas" w:hAnsi="Consolas" w:eastAsia="Consolas" w:cs="Consolas"/>
-          <w:sz w:val="17"/>
-          <w:szCs w:val="17"/>
-        </w:rPr>
-        <w:t xml:space="preserve">      "breakout": false,</w:t>
-      </w:r>
-    </w:p>
-    <w:p>
-      <w:pPr>
-        <w:pBdr>
-          <w:left w:val="single" w:color="9CA3AF" w:sz="12" w:space="6"/>
-        </w:pBdr>
-        <w:shd w:val="clear" w:color="auto" w:fill="F3F4F6"/>
-        <w:spacing w:after="160" w:line="260" w:lineRule="auto"/>
-        <w:ind w:left="120" w:right="120"/>
-        <w:rPr>
-          <w:rFonts w:hint="default" w:ascii="Consolas" w:hAnsi="Consolas" w:eastAsia="Consolas" w:cs="Consolas"/>
-          <w:sz w:val="17"/>
-          <w:szCs w:val="17"/>
-        </w:rPr>
-      </w:pPr>
-      <w:r>
-        <w:rPr>
-          <w:rFonts w:hint="default" w:ascii="Consolas" w:hAnsi="Consolas" w:eastAsia="Consolas" w:cs="Consolas"/>
-          <w:sz w:val="17"/>
-          <w:szCs w:val="17"/>
-        </w:rPr>
-        <w:t xml:space="preserve">      "breakoutDirection": "None"</w:t>
+        <w:t xml:space="preserve">      "lastCandleDate": "2026-09-28"</w:t>
       </w:r>
     </w:p>
     <w:p>

</xml_diff>